<commit_message>
Add scalable context and local guidance lifecycle
</commit_message>
<xml_diff>
--- a/codex_ai_only_repository_framework_guide_v2-2.docx
+++ b/codex_ai_only_repository_framework_guide_v2-2.docx
@@ -2,7 +2,7 @@
 <file path=word/document.xml><?xml version="1.0" encoding="utf-8"?>
 <w:document xmlns:w="http://schemas.openxmlformats.org/wordprocessingml/2006/main" xmlns:m="http://schemas.openxmlformats.org/officeDocument/2006/math" xmlns:r="http://schemas.openxmlformats.org/officeDocument/2006/relationships" xmlns:o="urn:schemas-microsoft-com:office:office" xmlns:v="urn:schemas-microsoft-com:vml" xmlns:w10="urn:schemas-microsoft-com:office:word" xmlns:a="http://schemas.openxmlformats.org/drawingml/2006/main" xmlns:pic="http://schemas.openxmlformats.org/drawingml/2006/picture" xmlns:wp="http://schemas.openxmlformats.org/drawingml/2006/wordprocessingDrawing">
   <w:body>
-    <w:bookmarkStart w:id="45" w:name="X460ee5de772eec82d4a776e171b9c60d1e67509"/>
+    <w:bookmarkStart w:id="47" w:name="X460ee5de772eec82d4a776e171b9c60d1e67509"/>
     <w:p>
       <w:pPr>
         <w:pStyle w:val="Heading1"/>
@@ -622,7 +622,25 @@
         <w:rPr>
           <w:rStyle w:val="VerbatimChar"/>
         </w:rPr>
-        <w:t xml:space="preserve">│   │   └── _template.md</w:t>
+        <w:t xml:space="preserve">│   │   ├── _README.md</w:t>
+      </w:r>
+      <w:r>
+        <w:br/>
+      </w:r>
+      <w:r>
+        <w:rPr>
+          <w:rStyle w:val="VerbatimChar"/>
+        </w:rPr>
+        <w:t xml:space="preserve">│   │   ├── _template.md</w:t>
+      </w:r>
+      <w:r>
+        <w:br/>
+      </w:r>
+      <w:r>
+        <w:rPr>
+          <w:rStyle w:val="VerbatimChar"/>
+        </w:rPr>
+        <w:t xml:space="preserve">│   │   └── _index-template.md</w:t>
       </w:r>
       <w:r>
         <w:br/>
@@ -668,6 +686,33 @@
           <w:rStyle w:val="VerbatimChar"/>
         </w:rPr>
         <w:t xml:space="preserve">│   └── context-map</w:t>
+      </w:r>
+      <w:r>
+        <w:br/>
+      </w:r>
+      <w:r>
+        <w:rPr>
+          <w:rStyle w:val="VerbatimChar"/>
+        </w:rPr>
+        <w:t xml:space="preserve">├── templates/</w:t>
+      </w:r>
+      <w:r>
+        <w:br/>
+      </w:r>
+      <w:r>
+        <w:rPr>
+          <w:rStyle w:val="VerbatimChar"/>
+        </w:rPr>
+        <w:t xml:space="preserve">│   ├── local-AGENTS.md</w:t>
+      </w:r>
+      <w:r>
+        <w:br/>
+      </w:r>
+      <w:r>
+        <w:rPr>
+          <w:rStyle w:val="VerbatimChar"/>
+        </w:rPr>
+        <w:t xml:space="preserve">│   └── local-ARCHITECTURE.md</w:t>
       </w:r>
       <w:r>
         <w:br/>
@@ -1773,6 +1818,69 @@
         <w:t xml:space="preserve">아직 구현되지 않은 목표 구조는 Architecture의 현재 사실처럼 기록하지 않는다.</w:t>
       </w:r>
     </w:p>
+    <w:p>
+      <w:pPr>
+        <w:pStyle w:val="BodyText"/>
+      </w:pPr>
+      <w:r>
+        <w:t xml:space="preserve">작은 프로젝트는 루트 Architecture 하나로 시작한다. 특정 subtree의 내부 구조 때문에 루트 문서가 간결한 routing map 역할을 할 수 없을 때만 detail을 가장 가까운 local Architecture로 승격한다.</w:t>
+      </w:r>
+    </w:p>
+    <w:p>
+      <w:pPr>
+        <w:pStyle w:val="SourceCode"/>
+      </w:pPr>
+      <w:r>
+        <w:rPr>
+          <w:rStyle w:val="VerbatimChar"/>
+        </w:rPr>
+        <w:t xml:space="preserve">ARCHITECTURE.md</w:t>
+      </w:r>
+      <w:r>
+        <w:br/>
+      </w:r>
+      <w:r>
+        <w:rPr>
+          <w:rStyle w:val="VerbatimChar"/>
+        </w:rPr>
+        <w:t xml:space="preserve">  └─ services/payments/ARCHITECTURE.md</w:t>
+      </w:r>
+      <w:r>
+        <w:br/>
+      </w:r>
+      <w:r>
+        <w:rPr>
+          <w:rStyle w:val="VerbatimChar"/>
+        </w:rPr>
+        <w:t xml:space="preserve">       └─ memory/domains/payments/index.md</w:t>
+      </w:r>
+      <w:r>
+        <w:br/>
+      </w:r>
+      <w:r>
+        <w:rPr>
+          <w:rStyle w:val="VerbatimChar"/>
+        </w:rPr>
+        <w:t xml:space="preserve">            ├─ boundaries.md</w:t>
+      </w:r>
+      <w:r>
+        <w:br/>
+      </w:r>
+      <w:r>
+        <w:rPr>
+          <w:rStyle w:val="VerbatimChar"/>
+        </w:rPr>
+        <w:t xml:space="preserve">            └─ flows/refunds.md</w:t>
+      </w:r>
+    </w:p>
+    <w:p>
+      <w:pPr>
+        <w:pStyle w:val="FirstParagraph"/>
+      </w:pPr>
+      <w:r>
+        <w:t xml:space="preserve">루트 문서는 subtree의 owner와 local-map 링크만 유지한다. Local Architecture는 해당 subtree의 현재 module map, public entry point, dependency direction, transitional area만 설명하고 루트 내용을 복사하지 않는다.</w:t>
+      </w:r>
+    </w:p>
     <w:bookmarkEnd w:id="35"/>
     <w:bookmarkStart w:id="36" w:name="memorydirection.md-장기-판단-기준"/>
     <w:p>
@@ -1864,7 +1972,7 @@
       </w:r>
     </w:p>
     <w:bookmarkEnd w:id="36"/>
-    <w:bookmarkStart w:id="37" w:name="memorydomains-필요한-ownership만-기록"/>
+    <w:bookmarkStart w:id="38" w:name="memorydomains-필요한-ownership만-기록"/>
     <w:p>
       <w:pPr>
         <w:pStyle w:val="Heading2"/>
@@ -1961,14 +2069,13 @@
         <w:t xml:space="preserve">현재 상태에서 어느 방향으로 이동하는가?</w:t>
       </w:r>
     </w:p>
-    <w:bookmarkEnd w:id="37"/>
-    <w:bookmarkStart w:id="38" w:name="memorydecisions-필요한-이유만-보존"/>
-    <w:p>
-      <w:pPr>
-        <w:pStyle w:val="Heading2"/>
-      </w:pPr>
-      <w:r>
-        <w:t xml:space="preserve">17. memory/decisions/ — 필요한 이유만 보존</w:t>
+    <w:bookmarkStart w:id="37" w:name="domain-memory-lifecycle"/>
+    <w:p>
+      <w:pPr>
+        <w:pStyle w:val="Heading3"/>
+      </w:pPr>
+      <w:r>
+        <w:t xml:space="preserve">Domain memory lifecycle</w:t>
       </w:r>
     </w:p>
     <w:p>
@@ -1976,31 +2083,7 @@
         <w:pStyle w:val="FirstParagraph"/>
       </w:pPr>
       <w:r>
-        <w:t xml:space="preserve">Decision 문서는 코드만으로 이유를 복구하기 어렵고 미래 agent가 쉽게 뒤집어 반복 문제를 만들 수 있는 결정에만 사용한다. 일반 구현 세부사항과 작업 진행은 기록하지 않는다.</w:t>
-      </w:r>
-    </w:p>
-    <w:bookmarkEnd w:id="38"/>
-    <w:bookmarkStart w:id="39" w:name="context-map-읽기-전에-발견하기"/>
-    <w:p>
-      <w:pPr>
-        <w:pStyle w:val="Heading2"/>
-      </w:pPr>
-      <w:r>
-        <w:t xml:space="preserve">18. context-map — 읽기 전에 발견하기</w:t>
-      </w:r>
-    </w:p>
-    <w:p>
-      <w:pPr>
-        <w:pStyle w:val="FirstParagraph"/>
-      </w:pPr>
-      <w:r>
-        <w:rPr>
-          <w:rStyle w:val="VerbatimChar"/>
-        </w:rPr>
-        <w:t xml:space="preserve">./scripts/context-map</w:t>
-      </w:r>
-      <w:r>
-        <w:t xml:space="preserve">은 다음을 deterministic하게 보여준다.</w:t>
+        <w:t xml:space="preserve">Domain memory는 다음 조건 중 하나가 있을 때만 만든다.</w:t>
       </w:r>
     </w:p>
     <w:p>
@@ -2012,13 +2095,7 @@
         </w:numPr>
       </w:pPr>
       <w:r>
-        <w:rPr>
-          <w:rStyle w:val="VerbatimChar"/>
-        </w:rPr>
-        <w:t xml:space="preserve">memory/**/*.md</w:t>
-      </w:r>
-      <w:r>
-        <w:t xml:space="preserve">의 경로와 첫 H1</w:t>
+        <w:t xml:space="preserve">ownership이 코드와 Architecture만으로 명확하지 않다.</w:t>
       </w:r>
     </w:p>
     <w:p>
@@ -2030,31 +2107,74 @@
         </w:numPr>
       </w:pPr>
       <w:r>
+        <w:t xml:space="preserve">behavior가 반복해서 잘못된 module에 배치된다.</w:t>
+      </w:r>
+    </w:p>
+    <w:p>
+      <w:pPr>
+        <w:pStyle w:val="Compact"/>
+        <w:numPr>
+          <w:ilvl w:val="0"/>
+          <w:numId w:val="1011"/>
+        </w:numPr>
+      </w:pPr>
+      <w:r>
+        <w:t xml:space="preserve">다른 module이 internal boundary를 위반하기 쉽다.</w:t>
+      </w:r>
+    </w:p>
+    <w:p>
+      <w:pPr>
+        <w:pStyle w:val="Compact"/>
+        <w:numPr>
+          <w:ilvl w:val="0"/>
+          <w:numId w:val="1011"/>
+        </w:numPr>
+      </w:pPr>
+      <w:r>
+        <w:t xml:space="preserve">같은 invariant 또는 exception이 반복해서 재발견된다.</w:t>
+      </w:r>
+    </w:p>
+    <w:p>
+      <w:pPr>
+        <w:pStyle w:val="Compact"/>
+        <w:numPr>
+          <w:ilvl w:val="0"/>
+          <w:numId w:val="1011"/>
+        </w:numPr>
+      </w:pPr>
+      <w:r>
+        <w:t xml:space="preserve">preferred pattern과 tolerated legacy를 구분해야 한다.</w:t>
+      </w:r>
+    </w:p>
+    <w:p>
+      <w:pPr>
+        <w:pStyle w:val="FirstParagraph"/>
+      </w:pPr>
+      <w:r>
+        <w:t xml:space="preserve">Source directory, package, data type, CRUD 기능은 자동으로 domain이 아니다.</w:t>
+      </w:r>
+    </w:p>
+    <w:p>
+      <w:pPr>
+        <w:pStyle w:val="BodyText"/>
+      </w:pPr>
+      <w:r>
+        <w:t xml:space="preserve">처음에는</w:t>
+      </w:r>
+      <w:r>
+        <w:t xml:space="preserve"> </w:t>
+      </w:r>
+      <w:r>
         <w:rPr>
           <w:rStyle w:val="VerbatimChar"/>
         </w:rPr>
-        <w:t xml:space="preserve">state/active/*.md</w:t>
-      </w:r>
-      <w:r>
-        <w:t xml:space="preserve">의 경로와 첫 H1</w:t>
-      </w:r>
-    </w:p>
-    <w:p>
-      <w:pPr>
-        <w:pStyle w:val="FirstParagraph"/>
-      </w:pPr>
-      <w:r>
-        <w:t xml:space="preserve">AI 요약이나 중요도 판단은 하지 않는다. 무엇이 있는지 확인한 뒤 필요한 파일만 선택해서 읽게 한다.</w:t>
-      </w:r>
-    </w:p>
-    <w:bookmarkEnd w:id="39"/>
-    <w:bookmarkStart w:id="40" w:name="일반-작업-시나리오"/>
-    <w:p>
-      <w:pPr>
-        <w:pStyle w:val="Heading2"/>
-      </w:pPr>
-      <w:r>
-        <w:t xml:space="preserve">19. 일반 작업 시나리오</w:t>
+        <w:t xml:space="preserve">memory/domains/&lt;domain&gt;.md</w:t>
+      </w:r>
+      <w:r>
+        <w:t xml:space="preserve"> </w:t>
+      </w:r>
+      <w:r>
+        <w:t xml:space="preserve">한 파일로 시작한다. 서로 다른 작업이 관련 없는 detail을 함께 읽어야 할 때만 다음과 같이 승격한다.</w:t>
       </w:r>
     </w:p>
     <w:p>
@@ -2065,7 +2185,7 @@
         <w:rPr>
           <w:rStyle w:val="VerbatimChar"/>
         </w:rPr>
-        <w:t xml:space="preserve">1. Root가 AGENTS.md의 decision kernel 적용</w:t>
+        <w:t xml:space="preserve">memory/domains/payments/</w:t>
       </w:r>
       <w:r>
         <w:br/>
@@ -2074,7 +2194,7 @@
         <w:rPr>
           <w:rStyle w:val="VerbatimChar"/>
         </w:rPr>
-        <w:t xml:space="preserve">2. ARCHITECTURE.md / context-map으로 owner와 context 후보 발견</w:t>
+        <w:t xml:space="preserve">├── index.md</w:t>
       </w:r>
       <w:r>
         <w:br/>
@@ -2083,7 +2203,7 @@
         <w:rPr>
           <w:rStyle w:val="VerbatimChar"/>
         </w:rPr>
-        <w:t xml:space="preserve">3. Root가 task packet 구성</w:t>
+        <w:t xml:space="preserve">├── boundaries.md</w:t>
       </w:r>
       <w:r>
         <w:br/>
@@ -2092,7 +2212,7 @@
         <w:rPr>
           <w:rStyle w:val="VerbatimChar"/>
         </w:rPr>
-        <w:t xml:space="preserve">4. Coder 생성</w:t>
+        <w:t xml:space="preserve">└── flows/</w:t>
       </w:r>
       <w:r>
         <w:br/>
@@ -2101,62 +2221,141 @@
         <w:rPr>
           <w:rStyle w:val="VerbatimChar"/>
         </w:rPr>
-        <w:t xml:space="preserve">5. Coder가 ownership과 boundary 검증</w:t>
-      </w:r>
-      <w:r>
-        <w:br/>
-      </w:r>
+        <w:t xml:space="preserve">    └── refunds.md</w:t>
+      </w:r>
+    </w:p>
+    <w:p>
+      <w:pPr>
+        <w:pStyle w:val="FirstParagraph"/>
+      </w:pPr>
       <w:r>
         <w:rPr>
           <w:rStyle w:val="VerbatimChar"/>
         </w:rPr>
-        <w:t xml:space="preserve">6. 필요한 active state 생성 또는 갱신</w:t>
-      </w:r>
-      <w:r>
-        <w:br/>
+        <w:t xml:space="preserve">index.md</w:t>
+      </w:r>
+      <w:r>
+        <w:t xml:space="preserve">는 ownership과 public boundary를 짧게 유지하고 세부 context로 routing한다. 파일 길이 자체는 분할 근거가 아니며, 독립적인 작업에 독립적인 context가 필요한지가 기준이다.</w:t>
+      </w:r>
+    </w:p>
+    <w:p>
+      <w:pPr>
+        <w:pStyle w:val="BodyText"/>
+      </w:pPr>
+      <w:r>
+        <w:t xml:space="preserve">같은 owner를 설명하거나 의미 있는 독립 boundary가 없거나 항상 함께 읽는 domain은 합친다. Code와 Architecture만으로 내용이 충분히 명확해지거나 더 이상 판단을 바꾸지 않는 domain memory는 제거한다. 필요한 결정 이유만 decision 문서로 옮기고 Git history에 이전 내용을 맡긴다.</w:t>
+      </w:r>
+    </w:p>
+    <w:p>
+      <w:pPr>
+        <w:pStyle w:val="BodyText"/>
+      </w:pPr>
+      <w:r>
+        <w:t xml:space="preserve">Domain memory가 두 번째 architecture wiki가 되거나 구현 detail과 계속 동기화해야 한다면 범위를 줄이거나 제거한다.</w:t>
+      </w:r>
+    </w:p>
+    <w:bookmarkEnd w:id="37"/>
+    <w:bookmarkEnd w:id="38"/>
+    <w:bookmarkStart w:id="39" w:name="memorydecisions-필요한-이유만-보존"/>
+    <w:p>
+      <w:pPr>
+        <w:pStyle w:val="Heading2"/>
+      </w:pPr>
+      <w:r>
+        <w:t xml:space="preserve">17. memory/decisions/ — 필요한 이유만 보존</w:t>
+      </w:r>
+    </w:p>
+    <w:p>
+      <w:pPr>
+        <w:pStyle w:val="FirstParagraph"/>
+      </w:pPr>
+      <w:r>
+        <w:t xml:space="preserve">Decision 문서는 코드만으로 이유를 복구하기 어렵고 미래 agent가 쉽게 뒤집어 반복 문제를 만들 수 있는 결정에만 사용한다. 일반 구현 세부사항과 작업 진행은 기록하지 않는다.</w:t>
+      </w:r>
+    </w:p>
+    <w:bookmarkEnd w:id="39"/>
+    <w:bookmarkStart w:id="40" w:name="하위-agents.md-필요한-local-delta만-적용"/>
+    <w:p>
+      <w:pPr>
+        <w:pStyle w:val="Heading2"/>
+      </w:pPr>
+      <w:r>
+        <w:t xml:space="preserve">18. 하위 AGENTS.md — 필요한 local delta만 적용</w:t>
+      </w:r>
+    </w:p>
+    <w:p>
+      <w:pPr>
+        <w:pStyle w:val="FirstParagraph"/>
+      </w:pPr>
+      <w:r>
+        <w:t xml:space="preserve">하위</w:t>
+      </w:r>
+      <w:r>
+        <w:t xml:space="preserve"> </w:t>
       </w:r>
       <w:r>
         <w:rPr>
           <w:rStyle w:val="VerbatimChar"/>
         </w:rPr>
-        <w:t xml:space="preserve">7. 최소 변경 구현 및 check 실행</w:t>
-      </w:r>
-      <w:r>
-        <w:br/>
+        <w:t xml:space="preserve">AGENTS.md</w:t>
+      </w:r>
+      <w:r>
+        <w:t xml:space="preserve"> </w:t>
+      </w:r>
+      <w:r>
+        <w:t xml:space="preserve">또는</w:t>
+      </w:r>
+      <w:r>
+        <w:t xml:space="preserve"> </w:t>
       </w:r>
       <w:r>
         <w:rPr>
           <w:rStyle w:val="VerbatimChar"/>
         </w:rPr>
-        <w:t xml:space="preserve">8. Reviewer가 독립적으로 재검토</w:t>
-      </w:r>
-      <w:r>
-        <w:br/>
+        <w:t xml:space="preserve">AGENTS.override.md</w:t>
+      </w:r>
+      <w:r>
+        <w:t xml:space="preserve">는 subtree에 별도 command, operational constraint, review rule, 반복되는 local mistake가 있을 때만 만든다.</w:t>
+      </w:r>
+    </w:p>
+    <w:p>
+      <w:pPr>
+        <w:pStyle w:val="BodyText"/>
+      </w:pPr>
+      <w:r>
+        <w:t xml:space="preserve">하위 파일은 루트</w:t>
+      </w:r>
+      <w:r>
+        <w:t xml:space="preserve"> </w:t>
       </w:r>
       <w:r>
         <w:rPr>
           <w:rStyle w:val="VerbatimChar"/>
         </w:rPr>
-        <w:t xml:space="preserve">9. Root가 결과 통합</w:t>
-      </w:r>
-      <w:r>
-        <w:br/>
+        <w:t xml:space="preserve">AGENTS.md</w:t>
+      </w:r>
+      <w:r>
+        <w:t xml:space="preserve">를 복사하지 않는다. Scope, local constraint, local verification, 명시적 override와 이유만 기록한다. Domain 설명이나 architecture detail은 넣지 않고 해당 local Architecture 또는 domain memory로 연결한다.</w:t>
+      </w:r>
+    </w:p>
+    <w:p>
+      <w:pPr>
+        <w:pStyle w:val="BodyText"/>
+      </w:pPr>
+      <w:r>
+        <w:t xml:space="preserve">Codex는 프로젝트 루트에서 현재 working directory까지의 지침을 결합하고 더 가까운 파일을 나중에 적용한다. Root에서 시작한 agent는 변경 대상 경로의 local instruction을 명시적으로 확인해야 한다. Local template은</w:t>
+      </w:r>
+      <w:r>
+        <w:t xml:space="preserve"> </w:t>
       </w:r>
       <w:r>
         <w:rPr>
           <w:rStyle w:val="VerbatimChar"/>
         </w:rPr>
-        <w:t xml:space="preserve">10. active state 정리 및 필요한 durable memory만 반영</w:t>
-      </w:r>
-    </w:p>
-    <w:bookmarkEnd w:id="40"/>
-    <w:bookmarkStart w:id="41" w:name="새-프로젝트-도입"/>
-    <w:p>
-      <w:pPr>
-        <w:pStyle w:val="Heading2"/>
-      </w:pPr>
-      <w:r>
-        <w:t xml:space="preserve">20. 새 프로젝트 도입</w:t>
+        <w:t xml:space="preserve">templates/local-AGENTS.md</w:t>
+      </w:r>
+      <w:r>
+        <w:t xml:space="preserve">에 둔다.</w:t>
       </w:r>
     </w:p>
     <w:p>
@@ -2168,101 +2367,31 @@
         </w:numPr>
       </w:pPr>
       <w:r>
-        <w:t xml:space="preserve">프레임 내용을 프로젝트 루트에 복사한다.</w:t>
-      </w:r>
-    </w:p>
-    <w:p>
-      <w:pPr>
-        <w:pStyle w:val="Compact"/>
-        <w:numPr>
-          <w:ilvl w:val="0"/>
-          <w:numId w:val="1012"/>
-        </w:numPr>
-      </w:pPr>
-      <w:r>
-        <w:t xml:space="preserve">Root가 Steward에게 최소 module 및 ownership 제안을 요청한다.</w:t>
-      </w:r>
-    </w:p>
-    <w:p>
-      <w:pPr>
-        <w:pStyle w:val="Compact"/>
-        <w:numPr>
-          <w:ilvl w:val="0"/>
-          <w:numId w:val="1012"/>
-        </w:numPr>
-      </w:pPr>
-      <w:r>
-        <w:t xml:space="preserve">제안을 active state에 기록한다.</w:t>
-      </w:r>
-    </w:p>
-    <w:p>
-      <w:pPr>
-        <w:pStyle w:val="Compact"/>
-        <w:numPr>
-          <w:ilvl w:val="0"/>
-          <w:numId w:val="1012"/>
-        </w:numPr>
-      </w:pPr>
-      <w:r>
-        <w:t xml:space="preserve">Coder가 최소 skeleton과 첫 behavior를 구현한다.</w:t>
-      </w:r>
-    </w:p>
-    <w:p>
-      <w:pPr>
-        <w:pStyle w:val="Compact"/>
-        <w:numPr>
-          <w:ilvl w:val="0"/>
-          <w:numId w:val="1012"/>
-        </w:numPr>
-      </w:pPr>
-      <w:r>
-        <w:t xml:space="preserve">실제 구조를</w:t>
-      </w:r>
-      <w:r>
-        <w:t xml:space="preserve"> </w:t>
-      </w:r>
+        <w:t xml:space="preserve">https://learn.chatgpt.com/docs/agent-configuration/agents-md</w:t>
+      </w:r>
+    </w:p>
+    <w:bookmarkEnd w:id="40"/>
+    <w:bookmarkStart w:id="41" w:name="context-map-읽기-전에-발견하기"/>
+    <w:p>
+      <w:pPr>
+        <w:pStyle w:val="Heading2"/>
+      </w:pPr>
+      <w:r>
+        <w:t xml:space="preserve">19. context-map — 읽기 전에 발견하기</w:t>
+      </w:r>
+    </w:p>
+    <w:p>
+      <w:pPr>
+        <w:pStyle w:val="FirstParagraph"/>
+      </w:pPr>
       <w:r>
         <w:rPr>
           <w:rStyle w:val="VerbatimChar"/>
         </w:rPr>
-        <w:t xml:space="preserve">ARCHITECTURE.md</w:t>
-      </w:r>
-      <w:r>
-        <w:t xml:space="preserve">에 기록한다.</w:t>
-      </w:r>
-    </w:p>
-    <w:p>
-      <w:pPr>
-        <w:pStyle w:val="Compact"/>
-        <w:numPr>
-          <w:ilvl w:val="0"/>
-          <w:numId w:val="1012"/>
-        </w:numPr>
-      </w:pPr>
-      <w:r>
-        <w:t xml:space="preserve">Reviewer가 boundary와 dependency shape을 검토한다.</w:t>
-      </w:r>
-    </w:p>
-    <w:p>
-      <w:pPr>
-        <w:pStyle w:val="Compact"/>
-        <w:numPr>
-          <w:ilvl w:val="0"/>
-          <w:numId w:val="1012"/>
-        </w:numPr>
-      </w:pPr>
-      <w:r>
-        <w:t xml:space="preserve">실제 ownership 혼동이 생길 때만 domain memory를 추가한다.</w:t>
-      </w:r>
-    </w:p>
-    <w:bookmarkEnd w:id="41"/>
-    <w:bookmarkStart w:id="42" w:name="기존-프로젝트-도입"/>
-    <w:p>
-      <w:pPr>
-        <w:pStyle w:val="Heading2"/>
-      </w:pPr>
-      <w:r>
-        <w:t xml:space="preserve">21. 기존 프로젝트 도입</w:t>
+        <w:t xml:space="preserve">./scripts/context-map</w:t>
+      </w:r>
+      <w:r>
+        <w:t xml:space="preserve">은 다음을 deterministic하게 보여준다.</w:t>
       </w:r>
     </w:p>
     <w:p>
@@ -2274,7 +2403,13 @@
         </w:numPr>
       </w:pPr>
       <w:r>
-        <w:t xml:space="preserve">재설계 전에 현재 path, entry point, module, dependency를 조사한다.</w:t>
+        <w:rPr>
+          <w:rStyle w:val="VerbatimChar"/>
+        </w:rPr>
+        <w:t xml:space="preserve">memory/**/*.md</w:t>
+      </w:r>
+      <w:r>
+        <w:t xml:space="preserve">의 경로와 첫 H1</w:t>
       </w:r>
     </w:p>
     <w:p>
@@ -2289,64 +2424,142 @@
         <w:rPr>
           <w:rStyle w:val="VerbatimChar"/>
         </w:rPr>
-        <w:t xml:space="preserve">ARCHITECTURE.md</w:t>
-      </w:r>
-      <w:r>
-        <w:t xml:space="preserve">에 현재 현실과 transitional area를 기록한다.</w:t>
-      </w:r>
-    </w:p>
-    <w:p>
-      <w:pPr>
-        <w:pStyle w:val="Compact"/>
-        <w:numPr>
-          <w:ilvl w:val="0"/>
-          <w:numId w:val="1013"/>
-        </w:numPr>
-      </w:pPr>
-      <w:r>
-        <w:t xml:space="preserve">반복적으로 혼동되는 owner부터 domain memory를 만든다.</w:t>
-      </w:r>
-    </w:p>
-    <w:p>
-      <w:pPr>
-        <w:pStyle w:val="Compact"/>
-        <w:numPr>
-          <w:ilvl w:val="0"/>
-          <w:numId w:val="1013"/>
-        </w:numPr>
-      </w:pPr>
-      <w:r>
-        <w:t xml:space="preserve">현재 흔하지만 확장하면 안 되는 패턴을 tolerated 또는 local exception으로 표시한다.</w:t>
-      </w:r>
-    </w:p>
-    <w:p>
-      <w:pPr>
-        <w:pStyle w:val="Compact"/>
-        <w:numPr>
-          <w:ilvl w:val="0"/>
-          <w:numId w:val="1013"/>
-        </w:numPr>
-      </w:pPr>
-      <w:r>
-        <w:t xml:space="preserve">대규모 migration 대신 이후 작업에서 작은 방향성 개선을 누적한다.</w:t>
+        <w:t xml:space="preserve">state/active/*.md</w:t>
+      </w:r>
+      <w:r>
+        <w:t xml:space="preserve">의 경로와 첫 H1</w:t>
+      </w:r>
+    </w:p>
+    <w:p>
+      <w:pPr>
+        <w:pStyle w:val="FirstParagraph"/>
+      </w:pPr>
+      <w:r>
+        <w:t xml:space="preserve">이름이</w:t>
+      </w:r>
+      <w:r>
+        <w:t xml:space="preserve"> </w:t>
+      </w:r>
+      <w:r>
+        <w:rPr>
+          <w:rStyle w:val="VerbatimChar"/>
+        </w:rPr>
+        <w:t xml:space="preserve">_</w:t>
+      </w:r>
+      <w:r>
+        <w:t xml:space="preserve">로 시작하는 framework guidance와 template은 결과에서 제외한다. AI 요약이나 중요도 판단은 하지 않는다. 무엇이 있는지 확인한 뒤 필요한 파일만 선택해서 읽게 한다.</w:t>
+      </w:r>
+    </w:p>
+    <w:bookmarkEnd w:id="41"/>
+    <w:bookmarkStart w:id="42" w:name="일반-작업-시나리오"/>
+    <w:p>
+      <w:pPr>
+        <w:pStyle w:val="Heading2"/>
+      </w:pPr>
+      <w:r>
+        <w:t xml:space="preserve">20. 일반 작업 시나리오</w:t>
+      </w:r>
+    </w:p>
+    <w:p>
+      <w:pPr>
+        <w:pStyle w:val="SourceCode"/>
+      </w:pPr>
+      <w:r>
+        <w:rPr>
+          <w:rStyle w:val="VerbatimChar"/>
+        </w:rPr>
+        <w:t xml:space="preserve">1. Root가 AGENTS.md의 decision kernel 적용</w:t>
+      </w:r>
+      <w:r>
+        <w:br/>
+      </w:r>
+      <w:r>
+        <w:rPr>
+          <w:rStyle w:val="VerbatimChar"/>
+        </w:rPr>
+        <w:t xml:space="preserve">2. ARCHITECTURE.md / context-map으로 owner와 context 후보 발견</w:t>
+      </w:r>
+      <w:r>
+        <w:br/>
+      </w:r>
+      <w:r>
+        <w:rPr>
+          <w:rStyle w:val="VerbatimChar"/>
+        </w:rPr>
+        <w:t xml:space="preserve">3. Root가 task packet 구성</w:t>
+      </w:r>
+      <w:r>
+        <w:br/>
+      </w:r>
+      <w:r>
+        <w:rPr>
+          <w:rStyle w:val="VerbatimChar"/>
+        </w:rPr>
+        <w:t xml:space="preserve">4. Coder 생성</w:t>
+      </w:r>
+      <w:r>
+        <w:br/>
+      </w:r>
+      <w:r>
+        <w:rPr>
+          <w:rStyle w:val="VerbatimChar"/>
+        </w:rPr>
+        <w:t xml:space="preserve">5. Coder가 ownership과 boundary 검증</w:t>
+      </w:r>
+      <w:r>
+        <w:br/>
+      </w:r>
+      <w:r>
+        <w:rPr>
+          <w:rStyle w:val="VerbatimChar"/>
+        </w:rPr>
+        <w:t xml:space="preserve">6. 필요한 active state 생성 또는 갱신</w:t>
+      </w:r>
+      <w:r>
+        <w:br/>
+      </w:r>
+      <w:r>
+        <w:rPr>
+          <w:rStyle w:val="VerbatimChar"/>
+        </w:rPr>
+        <w:t xml:space="preserve">7. 최소 변경 구현 및 check 실행</w:t>
+      </w:r>
+      <w:r>
+        <w:br/>
+      </w:r>
+      <w:r>
+        <w:rPr>
+          <w:rStyle w:val="VerbatimChar"/>
+        </w:rPr>
+        <w:t xml:space="preserve">8. Reviewer가 독립적으로 재검토</w:t>
+      </w:r>
+      <w:r>
+        <w:br/>
+      </w:r>
+      <w:r>
+        <w:rPr>
+          <w:rStyle w:val="VerbatimChar"/>
+        </w:rPr>
+        <w:t xml:space="preserve">9. Root가 결과 통합</w:t>
+      </w:r>
+      <w:r>
+        <w:br/>
+      </w:r>
+      <w:r>
+        <w:rPr>
+          <w:rStyle w:val="VerbatimChar"/>
+        </w:rPr>
+        <w:t xml:space="preserve">10. active state 정리 및 필요한 durable memory만 반영</w:t>
       </w:r>
     </w:p>
     <w:bookmarkEnd w:id="42"/>
-    <w:bookmarkStart w:id="43" w:name="만들지-않는-것"/>
+    <w:bookmarkStart w:id="43" w:name="새-프로젝트-도입"/>
     <w:p>
       <w:pPr>
         <w:pStyle w:val="Heading2"/>
       </w:pPr>
       <w:r>
-        <w:t xml:space="preserve">22. 만들지 않는 것</w:t>
-      </w:r>
-    </w:p>
-    <w:p>
-      <w:pPr>
-        <w:pStyle w:val="FirstParagraph"/>
-      </w:pPr>
-      <w:r>
-        <w:t xml:space="preserve">초기에는 다음을 만들지 않는다.</w:t>
+        <w:t xml:space="preserve">21. 새 프로젝트 도입</w:t>
       </w:r>
     </w:p>
     <w:p>
@@ -2358,7 +2571,7 @@
         </w:numPr>
       </w:pPr>
       <w:r>
-        <w:t xml:space="preserve">generated index 또는 dashboard</w:t>
+        <w:t xml:space="preserve">프레임 내용을 프로젝트 루트에 복사한다.</w:t>
       </w:r>
     </w:p>
     <w:p>
@@ -2370,7 +2583,7 @@
         </w:numPr>
       </w:pPr>
       <w:r>
-        <w:t xml:space="preserve">migration dashboard</w:t>
+        <w:t xml:space="preserve">Root가 Steward에게 최소 module 및 ownership 제안을 요청한다.</w:t>
       </w:r>
     </w:p>
     <w:p>
@@ -2382,7 +2595,7 @@
         </w:numPr>
       </w:pPr>
       <w:r>
-        <w:t xml:space="preserve">health registry</w:t>
+        <w:t xml:space="preserve">제안을 active state에 기록한다.</w:t>
       </w:r>
     </w:p>
     <w:p>
@@ -2394,7 +2607,7 @@
         </w:numPr>
       </w:pPr>
       <w:r>
-        <w:t xml:space="preserve">복잡한 frontmatter/schema</w:t>
+        <w:t xml:space="preserve">Coder가 최소 skeleton과 첫 behavior를 구현한다.</w:t>
       </w:r>
     </w:p>
     <w:p>
@@ -2406,7 +2619,19 @@
         </w:numPr>
       </w:pPr>
       <w:r>
-        <w:t xml:space="preserve">자동 memory-build pipeline</w:t>
+        <w:t xml:space="preserve">실제 구조를</w:t>
+      </w:r>
+      <w:r>
+        <w:t xml:space="preserve"> </w:t>
+      </w:r>
+      <w:r>
+        <w:rPr>
+          <w:rStyle w:val="VerbatimChar"/>
+        </w:rPr>
+        <w:t xml:space="preserve">ARCHITECTURE.md</w:t>
+      </w:r>
+      <w:r>
+        <w:t xml:space="preserve">에 기록한다.</w:t>
       </w:r>
     </w:p>
     <w:p>
@@ -2418,7 +2643,7 @@
         </w:numPr>
       </w:pPr>
       <w:r>
-        <w:t xml:space="preserve">모든 기능에 대한 domain 문서</w:t>
+        <w:t xml:space="preserve">Reviewer가 boundary와 dependency shape을 검토한다.</w:t>
       </w:r>
     </w:p>
     <w:p>
@@ -2430,25 +2655,17 @@
         </w:numPr>
       </w:pPr>
       <w:r>
-        <w:t xml:space="preserve">미래 확장을 위한 추상 module</w:t>
-      </w:r>
-    </w:p>
-    <w:p>
-      <w:pPr>
-        <w:pStyle w:val="FirstParagraph"/>
-      </w:pPr>
-      <w:r>
-        <w:t xml:space="preserve">반복되는 실제 비용이 확인될 때만 추가한다.</w:t>
+        <w:t xml:space="preserve">실제 ownership 혼동이 생길 때만 domain memory를 추가한다.</w:t>
       </w:r>
     </w:p>
     <w:bookmarkEnd w:id="43"/>
-    <w:bookmarkStart w:id="44" w:name="최종-원칙"/>
+    <w:bookmarkStart w:id="44" w:name="기존-프로젝트-도입"/>
     <w:p>
       <w:pPr>
         <w:pStyle w:val="Heading2"/>
       </w:pPr>
       <w:r>
-        <w:t xml:space="preserve">23. 최종 원칙</w:t>
+        <w:t xml:space="preserve">22. 기존 프로젝트 도입</w:t>
       </w:r>
     </w:p>
     <w:p>
@@ -2460,7 +2677,7 @@
         </w:numPr>
       </w:pPr>
       <w:r>
-        <w:t xml:space="preserve">Root는 공통 의사결정과 최초 context 전파를 소유한다.</w:t>
+        <w:t xml:space="preserve">재설계 전에 현재 path, entry point, module, dependency를 조사한다.</w:t>
       </w:r>
     </w:p>
     <w:p>
@@ -2472,7 +2689,13 @@
         </w:numPr>
       </w:pPr>
       <w:r>
-        <w:t xml:space="preserve">역할별 실행 지침은 공식 custom-agent TOML에 둔다.</w:t>
+        <w:rPr>
+          <w:rStyle w:val="VerbatimChar"/>
+        </w:rPr>
+        <w:t xml:space="preserve">ARCHITECTURE.md</w:t>
+      </w:r>
+      <w:r>
+        <w:t xml:space="preserve">에 현재 현실과 transitional area를 기록한다.</w:t>
       </w:r>
     </w:p>
     <w:p>
@@ -2484,7 +2707,7 @@
         </w:numPr>
       </w:pPr>
       <w:r>
-        <w:t xml:space="preserve">Ownership precedes implementation.</w:t>
+        <w:t xml:space="preserve">반복적으로 혼동되는 owner부터 domain memory를 만든다.</w:t>
       </w:r>
     </w:p>
     <w:p>
@@ -2496,7 +2719,7 @@
         </w:numPr>
       </w:pPr>
       <w:r>
-        <w:t xml:space="preserve">Context is discovered globally but loaded locally.</w:t>
+        <w:t xml:space="preserve">현재 흔하지만 확장하면 안 되는 패턴을 tolerated 또는 local exception으로 표시한다.</w:t>
       </w:r>
     </w:p>
     <w:p>
@@ -2508,7 +2731,7 @@
         </w:numPr>
       </w:pPr>
       <w:r>
-        <w:t xml:space="preserve">새 코드는 최소한의 cohesive module과 명시적 boundary로 시작한다.</w:t>
+        <w:t xml:space="preserve">대규모 migration 대신 이후 작업에서 작은 방향성 개선을 누적한다.</w:t>
       </w:r>
     </w:p>
     <w:p>
@@ -2520,7 +2743,25 @@
         </w:numPr>
       </w:pPr>
       <w:r>
-        <w:t xml:space="preserve">Active state와 durable memory를 분리한다.</w:t>
+        <w:t xml:space="preserve">루트 routing이 부족해질 때만 local Architecture, domain index, 하위 AGENTS를 추가한다.</w:t>
+      </w:r>
+    </w:p>
+    <w:bookmarkEnd w:id="44"/>
+    <w:bookmarkStart w:id="45" w:name="만들지-않는-것"/>
+    <w:p>
+      <w:pPr>
+        <w:pStyle w:val="Heading2"/>
+      </w:pPr>
+      <w:r>
+        <w:t xml:space="preserve">23. 만들지 않는 것</w:t>
+      </w:r>
+    </w:p>
+    <w:p>
+      <w:pPr>
+        <w:pStyle w:val="FirstParagraph"/>
+      </w:pPr>
+      <w:r>
+        <w:t xml:space="preserve">초기에는 다음을 만들지 않는다.</w:t>
       </w:r>
     </w:p>
     <w:p>
@@ -2528,11 +2769,11 @@
         <w:pStyle w:val="Compact"/>
         <w:numPr>
           <w:ilvl w:val="0"/>
-          <w:numId w:val="1015"/>
+          <w:numId w:val="1016"/>
         </w:numPr>
       </w:pPr>
       <w:r>
-        <w:t xml:space="preserve">Coder는 중요한 작업의 최신 checkpoint를 유지한다.</w:t>
+        <w:t xml:space="preserve">generated index 또는 dashboard</w:t>
       </w:r>
     </w:p>
     <w:p>
@@ -2540,11 +2781,11 @@
         <w:pStyle w:val="Compact"/>
         <w:numPr>
           <w:ilvl w:val="0"/>
-          <w:numId w:val="1015"/>
+          <w:numId w:val="1016"/>
         </w:numPr>
       </w:pPr>
       <w:r>
-        <w:t xml:space="preserve">Reviewer는 문제를 독립적으로 재구성한다.</w:t>
+        <w:t xml:space="preserve">migration dashboard</w:t>
       </w:r>
     </w:p>
     <w:p>
@@ -2552,11 +2793,11 @@
         <w:pStyle w:val="Compact"/>
         <w:numPr>
           <w:ilvl w:val="0"/>
-          <w:numId w:val="1015"/>
+          <w:numId w:val="1016"/>
         </w:numPr>
       </w:pPr>
       <w:r>
-        <w:t xml:space="preserve">Steward는 문서가 아니라 미래 repository를 개선한다.</w:t>
+        <w:t xml:space="preserve">health registry</w:t>
       </w:r>
     </w:p>
     <w:p>
@@ -2564,15 +2805,213 @@
         <w:pStyle w:val="Compact"/>
         <w:numPr>
           <w:ilvl w:val="0"/>
-          <w:numId w:val="1015"/>
+          <w:numId w:val="1016"/>
         </w:numPr>
       </w:pPr>
       <w:r>
+        <w:t xml:space="preserve">복잡한 frontmatter/schema</w:t>
+      </w:r>
+    </w:p>
+    <w:p>
+      <w:pPr>
+        <w:pStyle w:val="Compact"/>
+        <w:numPr>
+          <w:ilvl w:val="0"/>
+          <w:numId w:val="1016"/>
+        </w:numPr>
+      </w:pPr>
+      <w:r>
+        <w:t xml:space="preserve">자동 memory-build pipeline</w:t>
+      </w:r>
+    </w:p>
+    <w:p>
+      <w:pPr>
+        <w:pStyle w:val="Compact"/>
+        <w:numPr>
+          <w:ilvl w:val="0"/>
+          <w:numId w:val="1016"/>
+        </w:numPr>
+      </w:pPr>
+      <w:r>
+        <w:t xml:space="preserve">모든 기능에 대한 domain 문서</w:t>
+      </w:r>
+    </w:p>
+    <w:p>
+      <w:pPr>
+        <w:pStyle w:val="Compact"/>
+        <w:numPr>
+          <w:ilvl w:val="0"/>
+          <w:numId w:val="1016"/>
+        </w:numPr>
+      </w:pPr>
+      <w:r>
+        <w:t xml:space="preserve">미래 확장을 위한 추상 module</w:t>
+      </w:r>
+    </w:p>
+    <w:p>
+      <w:pPr>
+        <w:pStyle w:val="FirstParagraph"/>
+      </w:pPr>
+      <w:r>
+        <w:t xml:space="preserve">반복되는 실제 비용이 확인될 때만 추가한다.</w:t>
+      </w:r>
+    </w:p>
+    <w:bookmarkEnd w:id="45"/>
+    <w:bookmarkStart w:id="46" w:name="최종-원칙"/>
+    <w:p>
+      <w:pPr>
+        <w:pStyle w:val="Heading2"/>
+      </w:pPr>
+      <w:r>
+        <w:t xml:space="preserve">24. 최종 원칙</w:t>
+      </w:r>
+    </w:p>
+    <w:p>
+      <w:pPr>
+        <w:pStyle w:val="Compact"/>
+        <w:numPr>
+          <w:ilvl w:val="0"/>
+          <w:numId w:val="1017"/>
+        </w:numPr>
+      </w:pPr>
+      <w:r>
+        <w:t xml:space="preserve">Root는 공통 의사결정과 최초 context 전파를 소유한다.</w:t>
+      </w:r>
+    </w:p>
+    <w:p>
+      <w:pPr>
+        <w:pStyle w:val="Compact"/>
+        <w:numPr>
+          <w:ilvl w:val="0"/>
+          <w:numId w:val="1017"/>
+        </w:numPr>
+      </w:pPr>
+      <w:r>
+        <w:t xml:space="preserve">역할별 실행 지침은 공식 custom-agent TOML에 둔다.</w:t>
+      </w:r>
+    </w:p>
+    <w:p>
+      <w:pPr>
+        <w:pStyle w:val="Compact"/>
+        <w:numPr>
+          <w:ilvl w:val="0"/>
+          <w:numId w:val="1017"/>
+        </w:numPr>
+      </w:pPr>
+      <w:r>
+        <w:t xml:space="preserve">Ownership precedes implementation.</w:t>
+      </w:r>
+    </w:p>
+    <w:p>
+      <w:pPr>
+        <w:pStyle w:val="Compact"/>
+        <w:numPr>
+          <w:ilvl w:val="0"/>
+          <w:numId w:val="1017"/>
+        </w:numPr>
+      </w:pPr>
+      <w:r>
+        <w:t xml:space="preserve">Context is discovered globally but loaded locally.</w:t>
+      </w:r>
+    </w:p>
+    <w:p>
+      <w:pPr>
+        <w:pStyle w:val="Compact"/>
+        <w:numPr>
+          <w:ilvl w:val="0"/>
+          <w:numId w:val="1017"/>
+        </w:numPr>
+      </w:pPr>
+      <w:r>
+        <w:t xml:space="preserve">새 코드는 최소한의 cohesive module과 명시적 boundary로 시작한다.</w:t>
+      </w:r>
+    </w:p>
+    <w:p>
+      <w:pPr>
+        <w:pStyle w:val="Compact"/>
+        <w:numPr>
+          <w:ilvl w:val="0"/>
+          <w:numId w:val="1017"/>
+        </w:numPr>
+      </w:pPr>
+      <w:r>
+        <w:t xml:space="preserve">Active state와 durable memory를 분리한다.</w:t>
+      </w:r>
+    </w:p>
+    <w:p>
+      <w:pPr>
+        <w:pStyle w:val="Compact"/>
+        <w:numPr>
+          <w:ilvl w:val="0"/>
+          <w:numId w:val="1017"/>
+        </w:numPr>
+      </w:pPr>
+      <w:r>
+        <w:t xml:space="preserve">Coder는 중요한 작업의 최신 checkpoint를 유지한다.</w:t>
+      </w:r>
+    </w:p>
+    <w:p>
+      <w:pPr>
+        <w:pStyle w:val="Compact"/>
+        <w:numPr>
+          <w:ilvl w:val="0"/>
+          <w:numId w:val="1017"/>
+        </w:numPr>
+      </w:pPr>
+      <w:r>
+        <w:t xml:space="preserve">Reviewer는 문제를 독립적으로 재구성한다.</w:t>
+      </w:r>
+    </w:p>
+    <w:p>
+      <w:pPr>
+        <w:pStyle w:val="Compact"/>
+        <w:numPr>
+          <w:ilvl w:val="0"/>
+          <w:numId w:val="1017"/>
+        </w:numPr>
+      </w:pPr>
+      <w:r>
+        <w:t xml:space="preserve">Steward는 문서가 아니라 미래 repository를 개선한다.</w:t>
+      </w:r>
+    </w:p>
+    <w:p>
+      <w:pPr>
+        <w:pStyle w:val="Compact"/>
+        <w:numPr>
+          <w:ilvl w:val="0"/>
+          <w:numId w:val="1017"/>
+        </w:numPr>
+      </w:pPr>
+      <w:r>
         <w:t xml:space="preserve">Governance는 해결하는 문제보다 복잡해지면 안 된다.</w:t>
       </w:r>
     </w:p>
-    <w:bookmarkEnd w:id="44"/>
-    <w:bookmarkEnd w:id="45"/>
+    <w:p>
+      <w:pPr>
+        <w:pStyle w:val="Compact"/>
+        <w:numPr>
+          <w:ilvl w:val="0"/>
+          <w:numId w:val="1017"/>
+        </w:numPr>
+      </w:pPr>
+      <w:r>
+        <w:t xml:space="preserve">Domain memory와 local instructions는 반복 판단 비용을 줄이는 동안만 유지한다.</w:t>
+      </w:r>
+    </w:p>
+    <w:p>
+      <w:pPr>
+        <w:pStyle w:val="Compact"/>
+        <w:numPr>
+          <w:ilvl w:val="0"/>
+          <w:numId w:val="1017"/>
+        </w:numPr>
+      </w:pPr>
+      <w:r>
+        <w:t xml:space="preserve">복잡성은 필요가 증명될 때 root map에서 local map으로 한 단계씩 승격한다.</w:t>
+      </w:r>
+    </w:p>
+    <w:bookmarkEnd w:id="46"/>
+    <w:bookmarkEnd w:id="47"/>
     <w:sectPr>
       <w:footerReference r:id="rId9" w:type="default"/>
       <w:pgSz w:h="15840" w:w="12240"/>
@@ -3180,6 +3619,12 @@
     <w:abstractNumId w:val="991"/>
   </w:num>
   <w:num w:numId="1012">
+    <w:abstractNumId w:val="991"/>
+  </w:num>
+  <w:num w:numId="1013">
+    <w:abstractNumId w:val="991"/>
+  </w:num>
+  <w:num w:numId="1014">
     <w:abstractNumId w:val="99411"/>
     <w:lvlOverride w:ilvl="0">
       <w:startOverride w:val="1"/>
@@ -3209,7 +3654,7 @@
       <w:startOverride w:val="1"/>
     </w:lvlOverride>
   </w:num>
-  <w:num w:numId="1013">
+  <w:num w:numId="1015">
     <w:abstractNumId w:val="99411"/>
     <w:lvlOverride w:ilvl="0">
       <w:startOverride w:val="1"/>
@@ -3239,10 +3684,10 @@
       <w:startOverride w:val="1"/>
     </w:lvlOverride>
   </w:num>
-  <w:num w:numId="1014">
+  <w:num w:numId="1016">
     <w:abstractNumId w:val="991"/>
   </w:num>
-  <w:num w:numId="1015">
+  <w:num w:numId="1017">
     <w:abstractNumId w:val="99411"/>
     <w:lvlOverride w:ilvl="0">
       <w:startOverride w:val="1"/>

</xml_diff>